<commit_message>
fix(word): add num default-restarts counter; opt-in continue=true
OOXML quirk: two num instances pointing at the same abstractNum
*continue counting* unless the new num carries an explicit
<w:lvlOverride><w:startOverride/></w:lvlOverride>. That contradicts
what API users expect of "build a new num instance" — they expect an
independent counter. AddNum now auto-injects startOverride.0 set to
the abstractNum's level0 start (typically 1) by default. Users who
want Word's literal continuation pass --prop continue=true.

Explicit --prop start=N still overrides, --prop startOverride.N=v
still works. Bare keys take precedence over the auto-inject default.

Showcase script section 2 reworked to demonstrate both modes
(default-restart vs continue=true). Section 4 level1 now sets
font=Arial so the ▶ glyph isn't substituted by the emoji font on macOS.
</commit_message>
<xml_diff>
--- a/examples/word/numbering-showcase.docx
+++ b/examples/word/numbering-showcase.docx
@@ -145,31 +145,7 @@
           <w:b/>
           <w:sz w:val="28"/>
         </w:rPr>
-        <w:t xml:space="preserve">2. Independent counters sharing one template</w:t>
-      </w:r>
-    </w:p>
-    <w:p>
-      <w:pPr>
-        <w:numPr>
-          <w:ilvl w:val="0"/>
-          <w:numId w:val="1"/>
-        </w:numPr>
-      </w:pPr>
-      <w:r>
-        <w:rPr/>
-        <w:t xml:space="preserve">List A item one</w:t>
-      </w:r>
-    </w:p>
-    <w:p>
-      <w:pPr>
-        <w:numPr>
-          <w:ilvl w:val="0"/>
-          <w:numId w:val="1"/>
-        </w:numPr>
-      </w:pPr>
-      <w:r>
-        <w:rPr/>
-        <w:t xml:space="preserve">List A item two (continues counting from above)</w:t>
+        <w:t xml:space="preserve">2. Independent counters (default) and continue=true opt-in</w:t>
       </w:r>
     </w:p>
     <w:p>
@@ -181,7 +157,7 @@
       </w:pPr>
       <w:r>
         <w:rPr/>
-        <w:t xml:space="preserve">List B starts fresh at 1</w:t>
+        <w:t xml:space="preserve">List B starts fresh at 1 (default behavior)</w:t>
       </w:r>
     </w:p>
     <w:p>
@@ -193,7 +169,31 @@
       </w:pPr>
       <w:r>
         <w:rPr/>
-        <w:t xml:space="preserve">List B item two</w:t>
+        <w:t xml:space="preserve">List B item two (counts 2)</w:t>
+      </w:r>
+    </w:p>
+    <w:p>
+      <w:pPr>
+        <w:numPr>
+          <w:ilvl w:val="0"/>
+          <w:numId w:val="3"/>
+        </w:numPr>
+      </w:pPr>
+      <w:r>
+        <w:rPr/>
+        <w:t xml:space="preserve">List C continues from List A's count (continue=true)</w:t>
+      </w:r>
+    </w:p>
+    <w:p>
+      <w:pPr>
+        <w:numPr>
+          <w:ilvl w:val="0"/>
+          <w:numId w:val="3"/>
+        </w:numPr>
+      </w:pPr>
+      <w:r>
+        <w:rPr/>
+        <w:t xml:space="preserve">List C item two</w:t>
       </w:r>
     </w:p>
     <w:p>
@@ -219,7 +219,7 @@
       <w:pPr>
         <w:numPr>
           <w:ilvl w:val="0"/>
-          <w:numId w:val="3"/>
+          <w:numId w:val="4"/>
         </w:numPr>
       </w:pPr>
       <w:r>
@@ -231,7 +231,7 @@
       <w:pPr>
         <w:numPr>
           <w:ilvl w:val="0"/>
-          <w:numId w:val="3"/>
+          <w:numId w:val="4"/>
         </w:numPr>
       </w:pPr>
       <w:r>
@@ -262,7 +262,7 @@
       <w:pPr>
         <w:numPr>
           <w:ilvl w:val="0"/>
-          <w:numId w:val="4"/>
+          <w:numId w:val="5"/>
         </w:numPr>
       </w:pPr>
       <w:r>
@@ -274,7 +274,7 @@
       <w:pPr>
         <w:numPr>
           <w:ilvl w:val="1"/>
-          <w:numId w:val="4"/>
+          <w:numId w:val="5"/>
         </w:numPr>
       </w:pPr>
       <w:r>
@@ -286,7 +286,7 @@
       <w:pPr>
         <w:numPr>
           <w:ilvl w:val="2"/>
-          <w:numId w:val="4"/>
+          <w:numId w:val="5"/>
         </w:numPr>
       </w:pPr>
       <w:r>
@@ -298,7 +298,7 @@
       <w:pPr>
         <w:numPr>
           <w:ilvl w:val="0"/>
-          <w:numId w:val="4"/>
+          <w:numId w:val="5"/>
         </w:numPr>
       </w:pPr>
       <w:r>
@@ -329,7 +329,7 @@
       <w:pPr>
         <w:numPr>
           <w:ilvl w:val="0"/>
-          <w:numId w:val="5"/>
+          <w:numId w:val="6"/>
         </w:numPr>
       </w:pPr>
       <w:r>
@@ -341,7 +341,7 @@
       <w:pPr>
         <w:numPr>
           <w:ilvl w:val="0"/>
-          <w:numId w:val="5"/>
+          <w:numId w:val="6"/>
         </w:numPr>
       </w:pPr>
       <w:r>
@@ -353,7 +353,7 @@
       <w:pPr>
         <w:numPr>
           <w:ilvl w:val="0"/>
-          <w:numId w:val="5"/>
+          <w:numId w:val="6"/>
         </w:numPr>
       </w:pPr>
       <w:r>
@@ -430,7 +430,7 @@
       <w:pPr>
         <w:numPr>
           <w:ilvl w:val="0"/>
-          <w:numId w:val="7"/>
+          <w:numId w:val="8"/>
         </w:numPr>
       </w:pPr>
       <w:r>
@@ -442,7 +442,7 @@
       <w:pPr>
         <w:numPr>
           <w:ilvl w:val="1"/>
-          <w:numId w:val="7"/>
+          <w:numId w:val="8"/>
         </w:numPr>
       </w:pPr>
       <w:r>
@@ -454,7 +454,7 @@
       <w:pPr>
         <w:numPr>
           <w:ilvl w:val="2"/>
-          <w:numId w:val="7"/>
+          <w:numId w:val="8"/>
         </w:numPr>
       </w:pPr>
       <w:r>
@@ -466,7 +466,7 @@
       <w:pPr>
         <w:numPr>
           <w:ilvl w:val="3"/>
-          <w:numId w:val="7"/>
+          <w:numId w:val="8"/>
         </w:numPr>
       </w:pPr>
       <w:r>
@@ -632,6 +632,7 @@
         <w:ind w:left="1440" w:hanging="360"/>
       </w:pPr>
       <w:rPr>
+        <w:rFonts w:ascii="Arial" w:hAnsi="Arial" w:eastAsia="Arial"/>
         <w:color w:val="2E74B5"/>
       </w:rPr>
     </w:lvl>
@@ -881,27 +882,48 @@
   </w:abstractNum>
   <w:num w:numId="1">
     <w:abstractNumId w:val="100"/>
+    <w:lvlOverride w:ilvl="0">
+      <w:startOverride w:val="1"/>
+    </w:lvlOverride>
   </w:num>
   <w:num w:numId="2">
     <w:abstractNumId w:val="100"/>
+    <w:lvlOverride w:ilvl="0">
+      <w:startOverride w:val="1"/>
+    </w:lvlOverride>
   </w:num>
   <w:num w:numId="3">
+    <w:abstractNumId w:val="100"/>
+  </w:num>
+  <w:num w:numId="4">
     <w:abstractNumId w:val="100"/>
     <w:lvlOverride w:ilvl="0">
       <w:startOverride w:val="100"/>
     </w:lvlOverride>
   </w:num>
-  <w:num w:numId="4">
+  <w:num w:numId="5">
     <w:abstractNumId w:val="200"/>
-  </w:num>
-  <w:num w:numId="5">
-    <w:abstractNumId w:val="201"/>
+    <w:lvlOverride w:ilvl="0">
+      <w:startOverride w:val="1"/>
+    </w:lvlOverride>
   </w:num>
   <w:num w:numId="6">
-    <w:abstractNumId w:val="300"/>
+    <w:abstractNumId w:val="201"/>
+    <w:lvlOverride w:ilvl="0">
+      <w:startOverride w:val="1"/>
+    </w:lvlOverride>
   </w:num>
   <w:num w:numId="7">
+    <w:abstractNumId w:val="300"/>
+    <w:lvlOverride w:ilvl="0">
+      <w:startOverride w:val="1"/>
+    </w:lvlOverride>
+  </w:num>
+  <w:num w:numId="8">
     <w:abstractNumId w:val="100"/>
+    <w:lvlOverride w:ilvl="0">
+      <w:startOverride w:val="1"/>
+    </w:lvlOverride>
   </w:num>
 </w:numbering>
 </file>
@@ -924,7 +946,7 @@
     <w:pPr>
       <w:numPr>
         <w:ilvl w:val="0"/>
-        <w:numId w:val="6"/>
+        <w:numId w:val="7"/>
       </w:numPr>
     </w:pPr>
   </w:style>

</xml_diff>